<commit_message>
Seed test: graph method built three ways, independently checked; results and guide
Claude-Session: https://claude.ai/code/session_01VCh7XeJpj5JpCzQtSzh7gK
</commit_message>
<xml_diff>
--- a/SEED_TEST_2026-10-20/00_START_HERE_Seed_Test.docx
+++ b/SEED_TEST_2026-10-20/00_START_HERE_Seed_Test.docx
@@ -2,7 +2,7 @@
 <file path=word/document.xml><?xml version="1.0" encoding="utf-8"?>
 <w:document xmlns:w="http://schemas.openxmlformats.org/wordprocessingml/2006/main" xmlns:m="http://schemas.openxmlformats.org/officeDocument/2006/math" xmlns:r="http://schemas.openxmlformats.org/officeDocument/2006/relationships" xmlns:o="urn:schemas-microsoft-com:office:office" xmlns:v="urn:schemas-microsoft-com:vml" xmlns:w10="urn:schemas-microsoft-com:office:word" xmlns:a="http://schemas.openxmlformats.org/drawingml/2006/main" xmlns:pic="http://schemas.openxmlformats.org/drawingml/2006/picture" xmlns:wp="http://schemas.openxmlformats.org/drawingml/2006/wordprocessingDrawing">
   <w:body>
-    <w:bookmarkStart w:id="24" w:name="start-here-seed-test-20-october-2026"/>
+    <w:bookmarkStart w:id="27" w:name="start-here-seed-test-20-october-2026"/>
     <w:p>
       <w:pPr>
         <w:pStyle w:val="Heading1"/>
@@ -25,227 +25,68 @@
         <w:pStyle w:val="FirstParagraph"/>
       </w:pPr>
       <w:r>
-        <w:t xml:space="preserve">A small, fair test for any seed-and-grow method. It needs no AI: just Python on any computer.</w:t>
-      </w:r>
-    </w:p>
-    <w:bookmarkEnd w:id="20"/>
-    <w:bookmarkStart w:id="21" w:name="how-to-use-it"/>
-    <w:p>
-      <w:pPr>
-        <w:pStyle w:val="Heading2"/>
-      </w:pPr>
-      <w:r>
-        <w:t xml:space="preserve">How to use it</w:t>
-      </w:r>
-    </w:p>
-    <w:p>
-      <w:pPr>
-        <w:numPr>
-          <w:ilvl w:val="0"/>
-          <w:numId w:val="1001"/>
-        </w:numPr>
-        <w:pStyle w:val="Compact"/>
-      </w:pPr>
-      <w:r>
-        <w:t xml:space="preserve">Open</w:t>
-      </w:r>
-      <w:r>
-        <w:t xml:space="preserve"> </w:t>
-      </w:r>
-      <w:r>
-        <w:rPr>
-          <w:rStyle w:val="VerbatimChar"/>
-        </w:rPr>
-        <w:t xml:space="preserve">seed_test.py</w:t>
-      </w:r>
-      <w:r>
-        <w:t xml:space="preserve">.</w:t>
-      </w:r>
-    </w:p>
-    <w:p>
-      <w:pPr>
-        <w:numPr>
-          <w:ilvl w:val="0"/>
-          <w:numId w:val="1001"/>
-        </w:numPr>
-        <w:pStyle w:val="Compact"/>
-      </w:pPr>
-      <w:r>
-        <w:t xml:space="preserve">Put your rules into</w:t>
-      </w:r>
-      <w:r>
-        <w:t xml:space="preserve"> </w:t>
-      </w:r>
-      <w:r>
-        <w:rPr>
-          <w:rStyle w:val="VerbatimChar"/>
-        </w:rPr>
-        <w:t xml:space="preserve">plant()</w:t>
-      </w:r>
-      <w:r>
-        <w:t xml:space="preserve"> </w:t>
-      </w:r>
-      <w:r>
-        <w:t xml:space="preserve">(data to seed) and</w:t>
-      </w:r>
-      <w:r>
-        <w:t xml:space="preserve"> </w:t>
-      </w:r>
-      <w:r>
-        <w:rPr>
-          <w:rStyle w:val="VerbatimChar"/>
-        </w:rPr>
-        <w:t xml:space="preserve">grow()</w:t>
-      </w:r>
-      <w:r>
-        <w:t xml:space="preserve"> </w:t>
-      </w:r>
-      <w:r>
-        <w:t xml:space="preserve">(seed to data).</w:t>
-      </w:r>
-    </w:p>
-    <w:p>
-      <w:pPr>
-        <w:numPr>
-          <w:ilvl w:val="0"/>
-          <w:numId w:val="1001"/>
-        </w:numPr>
-        <w:pStyle w:val="Compact"/>
-      </w:pPr>
-      <w:r>
-        <w:t xml:space="preserve">Run</w:t>
-      </w:r>
-      <w:r>
-        <w:t xml:space="preserve"> </w:t>
-      </w:r>
-      <w:r>
-        <w:rPr>
-          <w:rStyle w:val="VerbatimChar"/>
-        </w:rPr>
-        <w:t xml:space="preserve">python seed_test.py</w:t>
-      </w:r>
-      <w:r>
-        <w:t xml:space="preserve">, optionally followed by your own files, for example</w:t>
-      </w:r>
-      <w:r>
-        <w:t xml:space="preserve"> </w:t>
-      </w:r>
-      <w:r>
-        <w:rPr>
-          <w:rStyle w:val="VerbatimChar"/>
-        </w:rPr>
-        <w:t xml:space="preserve">python seed_test.py photo.jpg letter.txt</w:t>
-      </w:r>
-      <w:r>
-        <w:t xml:space="preserve">.</w:t>
-      </w:r>
-    </w:p>
-    <w:bookmarkEnd w:id="21"/>
-    <w:bookmarkStart w:id="22" w:name="what-the-test-does"/>
-    <w:p>
-      <w:pPr>
-        <w:pStyle w:val="Heading2"/>
-      </w:pPr>
-      <w:r>
-        <w:t xml:space="preserve">What the test does</w:t>
-      </w:r>
-    </w:p>
-    <w:p>
-      <w:pPr>
-        <w:numPr>
-          <w:ilvl w:val="0"/>
-          <w:numId w:val="1002"/>
-        </w:numPr>
-        <w:pStyle w:val="Compact"/>
-      </w:pPr>
+        <w:t xml:space="preserve">A fair test of the owner’s</w:t>
+      </w:r>
+      <w:r>
+        <w:t xml:space="preserve"> </w:t>
+      </w:r>
+      <w:r>
+        <w:t xml:space="preserve">“</w:t>
+      </w:r>
+      <w:r>
+        <w:t xml:space="preserve">data seed</w:t>
+      </w:r>
+      <w:r>
+        <w:t xml:space="preserve">”</w:t>
+      </w:r>
+      <w:r>
+        <w:t xml:space="preserve"> </w:t>
+      </w:r>
+      <w:r>
+        <w:t xml:space="preserve">idea: a tiny seed plus fixed, shared grow instructions should regrow the exact original data. It needs no AI, only Python on any computer.</w:t>
+      </w:r>
+    </w:p>
+    <w:p>
+      <w:pPr>
+        <w:pStyle w:val="BodyText"/>
+      </w:pPr>
+      <w:r>
+        <w:t xml:space="preserve">This folder also holds the owner’s</w:t>
+      </w:r>
+      <w:r>
+        <w:t xml:space="preserve"> </w:t>
+      </w:r>
       <w:r>
         <w:rPr>
           <w:bCs/>
           <w:b/>
         </w:rPr>
-        <w:t xml:space="preserve">Counts</w:t>
-      </w:r>
-      <w:r>
-        <w:t xml:space="preserve"> </w:t>
-      </w:r>
-      <w:r>
-        <w:t xml:space="preserve">the size of each seed in raw bytes.</w:t>
-      </w:r>
-    </w:p>
-    <w:p>
-      <w:pPr>
-        <w:numPr>
-          <w:ilvl w:val="0"/>
-          <w:numId w:val="1002"/>
-        </w:numPr>
-        <w:pStyle w:val="Compact"/>
+        <w:t xml:space="preserve">graph method</w:t>
+      </w:r>
+      <w:r>
+        <w:t xml:space="preserve">, built three ways (the three closest readings of the owner’s description), and the results of running each one through the fair test.</w:t>
+      </w:r>
+    </w:p>
+    <w:bookmarkEnd w:id="20"/>
+    <w:bookmarkStart w:id="21" w:name="the-verdict-so-far"/>
+    <w:p>
+      <w:pPr>
+        <w:pStyle w:val="Heading2"/>
+      </w:pPr>
+      <w:r>
+        <w:t xml:space="preserve">The verdict so far</w:t>
+      </w:r>
+    </w:p>
+    <w:p>
+      <w:pPr>
+        <w:pStyle w:val="FirstParagraph"/>
       </w:pPr>
       <w:r>
         <w:rPr>
           <w:bCs/>
           <w:b/>
         </w:rPr>
-        <w:t xml:space="preserve">Checks</w:t>
-      </w:r>
-      <w:r>
-        <w:t xml:space="preserve"> </w:t>
-      </w:r>
-      <w:r>
-        <w:t xml:space="preserve">that the regrown file matches the original exactly (a SHA-256 fingerprint).</w:t>
-      </w:r>
-    </w:p>
-    <w:p>
-      <w:pPr>
-        <w:numPr>
-          <w:ilvl w:val="0"/>
-          <w:numId w:val="1002"/>
-        </w:numPr>
-        <w:pStyle w:val="Compact"/>
-      </w:pPr>
-      <w:r>
-        <w:rPr>
-          <w:bCs/>
-          <w:b/>
-        </w:rPr>
-        <w:t xml:space="preserve">Grows each seed in a separate process</w:t>
-      </w:r>
-      <w:r>
-        <w:t xml:space="preserve"> </w:t>
-      </w:r>
-      <w:r>
-        <w:t xml:space="preserve">that never sees the original.</w:t>
-      </w:r>
-    </w:p>
-    <w:p>
-      <w:pPr>
-        <w:numPr>
-          <w:ilvl w:val="0"/>
-          <w:numId w:val="1002"/>
-        </w:numPr>
-        <w:pStyle w:val="Compact"/>
-      </w:pPr>
-      <w:r>
-        <w:rPr>
-          <w:bCs/>
-          <w:b/>
-        </w:rPr>
-        <w:t xml:space="preserve">Includes random bytes,</w:t>
-      </w:r>
-      <w:r>
-        <w:t xml:space="preserve"> </w:t>
-      </w:r>
-      <w:r>
-        <w:t xml:space="preserve">the hardest possible case.</w:t>
-      </w:r>
-    </w:p>
-    <w:bookmarkEnd w:id="22"/>
-    <w:bookmarkStart w:id="23" w:name="files"/>
-    <w:p>
-      <w:pPr>
-        <w:pStyle w:val="Heading2"/>
-      </w:pPr>
-      <w:r>
-        <w:t xml:space="preserve">Files</w:t>
+        <w:t xml:space="preserve">Every method regrew every file exactly (5 of 5 files each), and independent checkers passed all three graph methods as fair.</w:t>
       </w:r>
     </w:p>
     <w:tbl>
@@ -256,8 +97,11 @@
         <w:jc w:val="start"/>
       </w:tblPr>
       <w:tblGrid>
-        <w:gridCol w:w="3960"/>
-        <w:gridCol w:w="3960"/>
+        <w:gridCol w:w="1584"/>
+        <w:gridCol w:w="1584"/>
+        <w:gridCol w:w="1584"/>
+        <w:gridCol w:w="1584"/>
+        <w:gridCol w:w="1584"/>
       </w:tblGrid>
       <w:tr>
         <w:trPr>
@@ -271,7 +115,1184 @@
               <w:jc w:val="left"/>
             </w:pPr>
             <w:r>
-              <w:t xml:space="preserve">File</w:t>
+              <w:t xml:space="preserve">Test file</w:t>
+            </w:r>
+          </w:p>
+        </w:tc>
+        <w:tc>
+          <w:tcPr/>
+          <w:p>
+            <w:pPr>
+              <w:pStyle w:val="Compact"/>
+              <w:jc w:val="left"/>
+            </w:pPr>
+            <w:r>
+              <w:t xml:space="preserve">Zip (for comparison)</w:t>
+            </w:r>
+          </w:p>
+        </w:tc>
+        <w:tc>
+          <w:tcPr/>
+          <w:p>
+            <w:pPr>
+              <w:pStyle w:val="Compact"/>
+              <w:jc w:val="left"/>
+            </w:pPr>
+            <w:r>
+              <w:t xml:space="preserve">Graph: fit the shape</w:t>
+            </w:r>
+          </w:p>
+        </w:tc>
+        <w:tc>
+          <w:tcPr/>
+          <w:p>
+            <w:pPr>
+              <w:pStyle w:val="Compact"/>
+              <w:jc w:val="left"/>
+            </w:pPr>
+            <w:r>
+              <w:t xml:space="preserve">Graph: work backwards</w:t>
+            </w:r>
+          </w:p>
+        </w:tc>
+        <w:tc>
+          <w:tcPr/>
+          <w:p>
+            <w:pPr>
+              <w:pStyle w:val="Compact"/>
+              <w:jc w:val="left"/>
+            </w:pPr>
+            <w:r>
+              <w:t xml:space="preserve">Graph: find it on a fixed page</w:t>
+            </w:r>
+          </w:p>
+        </w:tc>
+      </w:tr>
+      <w:tr>
+        <w:tc>
+          <w:tcPr/>
+          <w:p>
+            <w:pPr>
+              <w:pStyle w:val="Compact"/>
+              <w:jc w:val="left"/>
+            </w:pPr>
+            <w:r>
+              <w:t xml:space="preserve">Repeating pattern, 120,000 bytes</w:t>
+            </w:r>
+          </w:p>
+        </w:tc>
+        <w:tc>
+          <w:tcPr/>
+          <w:p>
+            <w:pPr>
+              <w:pStyle w:val="Compact"/>
+              <w:jc w:val="left"/>
+            </w:pPr>
+            <w:r>
+              <w:t xml:space="preserve">99.8% smaller</w:t>
+            </w:r>
+          </w:p>
+        </w:tc>
+        <w:tc>
+          <w:tcPr/>
+          <w:p>
+            <w:pPr>
+              <w:pStyle w:val="Compact"/>
+              <w:jc w:val="left"/>
+            </w:pPr>
+            <w:r>
+              <w:rPr>
+                <w:bCs/>
+                <w:b/>
+              </w:rPr>
+              <w:t xml:space="preserve">99.99%</w:t>
+            </w:r>
+            <w:r>
+              <w:t xml:space="preserve"> </w:t>
+            </w:r>
+            <w:r>
+              <w:t xml:space="preserve">(11 bytes)</w:t>
+            </w:r>
+          </w:p>
+        </w:tc>
+        <w:tc>
+          <w:tcPr/>
+          <w:p>
+            <w:pPr>
+              <w:pStyle w:val="Compact"/>
+              <w:jc w:val="left"/>
+            </w:pPr>
+            <w:r>
+              <w:rPr>
+                <w:bCs/>
+                <w:b/>
+              </w:rPr>
+              <w:t xml:space="preserve">99.99%</w:t>
+            </w:r>
+            <w:r>
+              <w:t xml:space="preserve"> </w:t>
+            </w:r>
+            <w:r>
+              <w:t xml:space="preserve">(10 bytes)</w:t>
+            </w:r>
+          </w:p>
+        </w:tc>
+        <w:tc>
+          <w:tcPr/>
+          <w:p>
+            <w:pPr>
+              <w:pStyle w:val="Compact"/>
+              <w:jc w:val="left"/>
+            </w:pPr>
+            <w:r>
+              <w:t xml:space="preserve">0%</w:t>
+            </w:r>
+          </w:p>
+        </w:tc>
+      </w:tr>
+      <w:tr>
+        <w:tc>
+          <w:tcPr/>
+          <w:p>
+            <w:pPr>
+              <w:pStyle w:val="Compact"/>
+              <w:jc w:val="left"/>
+            </w:pPr>
+            <w:r>
+              <w:t xml:space="preserve">Short text, 267 bytes</w:t>
+            </w:r>
+          </w:p>
+        </w:tc>
+        <w:tc>
+          <w:tcPr/>
+          <w:p>
+            <w:pPr>
+              <w:pStyle w:val="Compact"/>
+              <w:jc w:val="left"/>
+            </w:pPr>
+            <w:r>
+              <w:t xml:space="preserve">66.3%</w:t>
+            </w:r>
+          </w:p>
+        </w:tc>
+        <w:tc>
+          <w:tcPr/>
+          <w:p>
+            <w:pPr>
+              <w:pStyle w:val="Compact"/>
+              <w:jc w:val="left"/>
+            </w:pPr>
+            <w:r>
+              <w:t xml:space="preserve">64.4%</w:t>
+            </w:r>
+          </w:p>
+        </w:tc>
+        <w:tc>
+          <w:tcPr/>
+          <w:p>
+            <w:pPr>
+              <w:pStyle w:val="Compact"/>
+              <w:jc w:val="left"/>
+            </w:pPr>
+            <w:r>
+              <w:t xml:space="preserve">63.7%</w:t>
+            </w:r>
+          </w:p>
+        </w:tc>
+        <w:tc>
+          <w:tcPr/>
+          <w:p>
+            <w:pPr>
+              <w:pStyle w:val="Compact"/>
+              <w:jc w:val="left"/>
+            </w:pPr>
+            <w:r>
+              <w:t xml:space="preserve">-1.5%</w:t>
+            </w:r>
+          </w:p>
+        </w:tc>
+      </w:tr>
+      <w:tr>
+        <w:tc>
+          <w:tcPr/>
+          <w:p>
+            <w:pPr>
+              <w:pStyle w:val="Compact"/>
+              <w:jc w:val="left"/>
+            </w:pPr>
+            <w:r>
+              <w:t xml:space="preserve">Bible text, 100,000 bytes</w:t>
+            </w:r>
+          </w:p>
+        </w:tc>
+        <w:tc>
+          <w:tcPr/>
+          <w:p>
+            <w:pPr>
+              <w:pStyle w:val="Compact"/>
+              <w:jc w:val="left"/>
+            </w:pPr>
+            <w:r>
+              <w:t xml:space="preserve">70.2%</w:t>
+            </w:r>
+          </w:p>
+        </w:tc>
+        <w:tc>
+          <w:tcPr/>
+          <w:p>
+            <w:pPr>
+              <w:pStyle w:val="Compact"/>
+              <w:jc w:val="left"/>
+            </w:pPr>
+            <w:r>
+              <w:t xml:space="preserve">19.3%</w:t>
+            </w:r>
+          </w:p>
+        </w:tc>
+        <w:tc>
+          <w:tcPr/>
+          <w:p>
+            <w:pPr>
+              <w:pStyle w:val="Compact"/>
+              <w:jc w:val="left"/>
+            </w:pPr>
+            <w:r>
+              <w:t xml:space="preserve">6.2%</w:t>
+            </w:r>
+          </w:p>
+        </w:tc>
+        <w:tc>
+          <w:tcPr/>
+          <w:p>
+            <w:pPr>
+              <w:pStyle w:val="Compact"/>
+              <w:jc w:val="left"/>
+            </w:pPr>
+            <w:r>
+              <w:t xml:space="preserve">0%</w:t>
+            </w:r>
+          </w:p>
+        </w:tc>
+      </w:tr>
+      <w:tr>
+        <w:tc>
+          <w:tcPr/>
+          <w:p>
+            <w:pPr>
+              <w:pStyle w:val="Compact"/>
+              <w:jc w:val="left"/>
+            </w:pPr>
+            <w:r>
+              <w:t xml:space="preserve">Word file, 11,110 bytes</w:t>
+            </w:r>
+          </w:p>
+        </w:tc>
+        <w:tc>
+          <w:tcPr/>
+          <w:p>
+            <w:pPr>
+              <w:pStyle w:val="Compact"/>
+              <w:jc w:val="left"/>
+            </w:pPr>
+            <w:r>
+              <w:t xml:space="preserve">9.9%</w:t>
+            </w:r>
+          </w:p>
+        </w:tc>
+        <w:tc>
+          <w:tcPr/>
+          <w:p>
+            <w:pPr>
+              <w:pStyle w:val="Compact"/>
+              <w:jc w:val="left"/>
+            </w:pPr>
+            <w:r>
+              <w:t xml:space="preserve">1.5%</w:t>
+            </w:r>
+          </w:p>
+        </w:tc>
+        <w:tc>
+          <w:tcPr/>
+          <w:p>
+            <w:pPr>
+              <w:pStyle w:val="Compact"/>
+              <w:jc w:val="left"/>
+            </w:pPr>
+            <w:r>
+              <w:t xml:space="preserve">1.9%</w:t>
+            </w:r>
+          </w:p>
+        </w:tc>
+        <w:tc>
+          <w:tcPr/>
+          <w:p>
+            <w:pPr>
+              <w:pStyle w:val="Compact"/>
+              <w:jc w:val="left"/>
+            </w:pPr>
+            <w:r>
+              <w:t xml:space="preserve">0%</w:t>
+            </w:r>
+          </w:p>
+        </w:tc>
+      </w:tr>
+      <w:tr>
+        <w:tc>
+          <w:tcPr/>
+          <w:p>
+            <w:pPr>
+              <w:pStyle w:val="Compact"/>
+              <w:jc w:val="left"/>
+            </w:pPr>
+            <w:r>
+              <w:t xml:space="preserve">Random bytes, 100,000</w:t>
+            </w:r>
+          </w:p>
+        </w:tc>
+        <w:tc>
+          <w:tcPr/>
+          <w:p>
+            <w:pPr>
+              <w:pStyle w:val="Compact"/>
+              <w:jc w:val="left"/>
+            </w:pPr>
+            <w:r>
+              <w:t xml:space="preserve">0%</w:t>
+            </w:r>
+          </w:p>
+        </w:tc>
+        <w:tc>
+          <w:tcPr/>
+          <w:p>
+            <w:pPr>
+              <w:pStyle w:val="Compact"/>
+              <w:jc w:val="left"/>
+            </w:pPr>
+            <w:r>
+              <w:t xml:space="preserve">0%</w:t>
+            </w:r>
+          </w:p>
+        </w:tc>
+        <w:tc>
+          <w:tcPr/>
+          <w:p>
+            <w:pPr>
+              <w:pStyle w:val="Compact"/>
+              <w:jc w:val="left"/>
+            </w:pPr>
+            <w:r>
+              <w:t xml:space="preserve">0%</w:t>
+            </w:r>
+          </w:p>
+        </w:tc>
+        <w:tc>
+          <w:tcPr/>
+          <w:p>
+            <w:pPr>
+              <w:pStyle w:val="Compact"/>
+              <w:jc w:val="left"/>
+            </w:pPr>
+            <w:r>
+              <w:t xml:space="preserve">0%</w:t>
+            </w:r>
+          </w:p>
+        </w:tc>
+      </w:tr>
+    </w:tbl>
+    <w:p>
+      <w:pPr>
+        <w:pStyle w:val="BodyText"/>
+      </w:pPr>
+      <w:r>
+        <w:t xml:space="preserve">What it means, in plain words:</w:t>
+      </w:r>
+      <w:r>
+        <w:t xml:space="preserve"> </w:t>
+      </w:r>
+      <w:r>
+        <w:t xml:space="preserve">-</w:t>
+      </w:r>
+      <w:r>
+        <w:t xml:space="preserve"> </w:t>
+      </w:r>
+      <w:r>
+        <w:rPr>
+          <w:bCs/>
+          <w:b/>
+        </w:rPr>
+        <w:t xml:space="preserve">The seed works where the data is a pattern.</w:t>
+      </w:r>
+      <w:r>
+        <w:t xml:space="preserve"> </w:t>
+      </w:r>
+      <w:r>
+        <w:t xml:space="preserve">A repeating pattern shrinks to 10 or 11 bytes, beating zip. That is where the owner’s 98.9% shows up.</w:t>
+      </w:r>
+      <w:r>
+        <w:t xml:space="preserve"> </w:t>
+      </w:r>
+      <w:r>
+        <w:t xml:space="preserve">-</w:t>
+      </w:r>
+      <w:r>
+        <w:t xml:space="preserve"> </w:t>
+      </w:r>
+      <w:r>
+        <w:rPr>
+          <w:bCs/>
+          <w:b/>
+        </w:rPr>
+        <w:t xml:space="preserve">It does not work on everyday text or files.</w:t>
+      </w:r>
+      <w:r>
+        <w:t xml:space="preserve"> </w:t>
+      </w:r>
+      <w:r>
+        <w:t xml:space="preserve">Words are not shaped like lines, curves or cycles, so the graph method keeps most of the text as it is (the</w:t>
+      </w:r>
+      <w:r>
+        <w:t xml:space="preserve"> </w:t>
+      </w:r>
+      <w:r>
+        <w:t xml:space="preserve">“</w:t>
+      </w:r>
+      <w:r>
+        <w:t xml:space="preserve">cucumber</w:t>
+      </w:r>
+      <w:r>
+        <w:t xml:space="preserve">”</w:t>
+      </w:r>
+      <w:r>
+        <w:t xml:space="preserve">). Zip does better on text.</w:t>
+      </w:r>
+      <w:r>
+        <w:t xml:space="preserve"> </w:t>
+      </w:r>
+      <w:r>
+        <w:t xml:space="preserve">-</w:t>
+      </w:r>
+      <w:r>
+        <w:t xml:space="preserve"> </w:t>
+      </w:r>
+      <w:r>
+        <w:rPr>
+          <w:bCs/>
+          <w:b/>
+        </w:rPr>
+        <w:t xml:space="preserve">Random data never shrinks, with any method.</w:t>
+      </w:r>
+      <w:r>
+        <w:t xml:space="preserve"> </w:t>
+      </w:r>
+      <w:r>
+        <w:t xml:space="preserve">This is the counting limit: there are more possible files than short seeds.</w:t>
+      </w:r>
+      <w:r>
+        <w:t xml:space="preserve"> </w:t>
+      </w:r>
+      <w:r>
+        <w:t xml:space="preserve">-</w:t>
+      </w:r>
+      <w:r>
+        <w:t xml:space="preserve"> </w:t>
+      </w:r>
+      <w:r>
+        <w:rPr>
+          <w:bCs/>
+          <w:b/>
+        </w:rPr>
+        <w:t xml:space="preserve">Finding data on a fixed page never saves space.</w:t>
+      </w:r>
+      <w:r>
+        <w:t xml:space="preserve"> </w:t>
+      </w:r>
+      <w:r>
+        <w:t xml:space="preserve">Naming a spot on the page costs as many 0s and 1s as the piece found there. The checkers confirmed this on fresh files too.</w:t>
+      </w:r>
+      <w:r>
+        <w:t xml:space="preserve"> </w:t>
+      </w:r>
+      <w:r>
+        <w:t xml:space="preserve">-</w:t>
+      </w:r>
+      <w:r>
+        <w:t xml:space="preserve"> </w:t>
+      </w:r>
+      <w:r>
+        <w:rPr>
+          <w:bCs/>
+          <w:b/>
+        </w:rPr>
+        <w:t xml:space="preserve">Strawberry, orange and cucumber are placeholder names</w:t>
+      </w:r>
+      <w:r>
+        <w:t xml:space="preserve"> </w:t>
+      </w:r>
+      <w:r>
+        <w:t xml:space="preserve">in the code. The owner has not yet shared their own factors. If the owner’s real factors work differently, they can be dropped into a new method file and tested the same way.</w:t>
+      </w:r>
+    </w:p>
+    <w:bookmarkEnd w:id="21"/>
+    <w:bookmarkStart w:id="22" w:name="timeline-of-what-was-done"/>
+    <w:p>
+      <w:pPr>
+        <w:pStyle w:val="Heading2"/>
+      </w:pPr>
+      <w:r>
+        <w:t xml:space="preserve">Timeline of what was done</w:t>
+      </w:r>
+    </w:p>
+    <w:p>
+      <w:pPr>
+        <w:numPr>
+          <w:ilvl w:val="0"/>
+          <w:numId w:val="1001"/>
+        </w:numPr>
+        <w:pStyle w:val="Compact"/>
+      </w:pPr>
+      <w:r>
+        <w:rPr>
+          <w:bCs/>
+          <w:b/>
+        </w:rPr>
+        <w:t xml:space="preserve">Seed test made (morning).</w:t>
+      </w:r>
+      <w:r>
+        <w:t xml:space="preserve"> </w:t>
+      </w:r>
+      <w:r>
+        <w:t xml:space="preserve">A fair, AI-free test with an example method (ordinary zip).</w:t>
+      </w:r>
+    </w:p>
+    <w:p>
+      <w:pPr>
+        <w:numPr>
+          <w:ilvl w:val="0"/>
+          <w:numId w:val="1001"/>
+        </w:numPr>
+        <w:pStyle w:val="Compact"/>
+      </w:pPr>
+      <w:r>
+        <w:rPr>
+          <w:bCs/>
+          <w:b/>
+        </w:rPr>
+        <w:t xml:space="preserve">Test upgraded.</w:t>
+      </w:r>
+      <w:r>
+        <w:t xml:space="preserve"> </w:t>
+      </w:r>
+      <w:r>
+        <w:t xml:space="preserve">It now runs several methods side by side, and grows each seed in a separate program inside an empty folder, so the grower cannot peek at the original.</w:t>
+      </w:r>
+    </w:p>
+    <w:p>
+      <w:pPr>
+        <w:numPr>
+          <w:ilvl w:val="0"/>
+          <w:numId w:val="1001"/>
+        </w:numPr>
+        <w:pStyle w:val="Compact"/>
+      </w:pPr>
+      <w:r>
+        <w:rPr>
+          <w:bCs/>
+          <w:b/>
+        </w:rPr>
+        <w:t xml:space="preserve">Graph method built three ways.</w:t>
+      </w:r>
+      <w:r>
+        <w:t xml:space="preserve"> </w:t>
+      </w:r>
+      <w:r>
+        <w:t xml:space="preserve">One builder for each reading of the owner’s description:</w:t>
+      </w:r>
+    </w:p>
+    <w:p>
+      <w:pPr>
+        <w:numPr>
+          <w:ilvl w:val="1"/>
+          <w:numId w:val="1002"/>
+        </w:numPr>
+        <w:pStyle w:val="Compact"/>
+      </w:pPr>
+      <w:r>
+        <w:rPr>
+          <w:bCs/>
+          <w:b/>
+        </w:rPr>
+        <w:t xml:space="preserve">Fit the shape</w:t>
+      </w:r>
+      <w:r>
+        <w:t xml:space="preserve"> </w:t>
+      </w:r>
+      <w:r>
+        <w:t xml:space="preserve">(</w:t>
+      </w:r>
+      <w:r>
+        <w:rPr>
+          <w:rStyle w:val="VerbatimChar"/>
+        </w:rPr>
+        <w:t xml:space="preserve">graph_fit</w:t>
+      </w:r>
+      <w:r>
+        <w:t xml:space="preserve">): the expression is the shape of the data.</w:t>
+      </w:r>
+    </w:p>
+    <w:p>
+      <w:pPr>
+        <w:numPr>
+          <w:ilvl w:val="1"/>
+          <w:numId w:val="1002"/>
+        </w:numPr>
+        <w:pStyle w:val="Compact"/>
+      </w:pPr>
+      <w:r>
+        <w:rPr>
+          <w:bCs/>
+          <w:b/>
+        </w:rPr>
+        <w:t xml:space="preserve">Work backwards</w:t>
+      </w:r>
+      <w:r>
+        <w:t xml:space="preserve"> </w:t>
+      </w:r>
+      <w:r>
+        <w:t xml:space="preserve">(</w:t>
+      </w:r>
+      <w:r>
+        <w:rPr>
+          <w:rStyle w:val="VerbatimChar"/>
+        </w:rPr>
+        <w:t xml:space="preserve">graph_backwards</w:t>
+      </w:r>
+      <w:r>
+        <w:t xml:space="preserve">): solve back from the data to the expression’s unknowns.</w:t>
+      </w:r>
+    </w:p>
+    <w:p>
+      <w:pPr>
+        <w:numPr>
+          <w:ilvl w:val="1"/>
+          <w:numId w:val="1002"/>
+        </w:numPr>
+        <w:pStyle w:val="Compact"/>
+      </w:pPr>
+      <w:r>
+        <w:rPr>
+          <w:bCs/>
+          <w:b/>
+        </w:rPr>
+        <w:t xml:space="preserve">Find it on a fixed page</w:t>
+      </w:r>
+      <w:r>
+        <w:t xml:space="preserve"> </w:t>
+      </w:r>
+      <w:r>
+        <w:t xml:space="preserve">(</w:t>
+      </w:r>
+      <w:r>
+        <w:rPr>
+          <w:rStyle w:val="VerbatimChar"/>
+        </w:rPr>
+        <w:t xml:space="preserve">graph_locate</w:t>
+      </w:r>
+      <w:r>
+        <w:t xml:space="preserve">): one expression grows an unchanging page of 0/1, and the seed lists positions on that page.</w:t>
+      </w:r>
+    </w:p>
+    <w:p>
+      <w:pPr>
+        <w:numPr>
+          <w:ilvl w:val="0"/>
+          <w:numId w:val="1001"/>
+        </w:numPr>
+        <w:pStyle w:val="Compact"/>
+      </w:pPr>
+      <w:r>
+        <w:rPr>
+          <w:bCs/>
+          <w:b/>
+        </w:rPr>
+        <w:t xml:space="preserve">Each method independently checked.</w:t>
+      </w:r>
+      <w:r>
+        <w:t xml:space="preserve"> </w:t>
+      </w:r>
+      <w:r>
+        <w:t xml:space="preserve">A separate checker tried to break each one. Checks covered:</w:t>
+      </w:r>
+    </w:p>
+    <w:p>
+      <w:pPr>
+        <w:numPr>
+          <w:ilvl w:val="1"/>
+          <w:numId w:val="1003"/>
+        </w:numPr>
+        <w:pStyle w:val="Compact"/>
+      </w:pPr>
+      <w:r>
+        <w:t xml:space="preserve">hundreds of round trips;</w:t>
+      </w:r>
+    </w:p>
+    <w:p>
+      <w:pPr>
+        <w:numPr>
+          <w:ilvl w:val="1"/>
+          <w:numId w:val="1003"/>
+        </w:numPr>
+        <w:pStyle w:val="Compact"/>
+      </w:pPr>
+      <w:r>
+        <w:t xml:space="preserve">fresh files the builder never saw;</w:t>
+      </w:r>
+    </w:p>
+    <w:p>
+      <w:pPr>
+        <w:numPr>
+          <w:ilvl w:val="1"/>
+          <w:numId w:val="1003"/>
+        </w:numPr>
+        <w:pStyle w:val="Compact"/>
+      </w:pPr>
+      <w:r>
+        <w:t xml:space="preserve">fairness: no peeking, no hidden zip, nothing tailored to the test files.</w:t>
+      </w:r>
+    </w:p>
+    <w:p>
+      <w:pPr>
+        <w:numPr>
+          <w:ilvl w:val="0"/>
+          <w:numId w:val="1000"/>
+        </w:numPr>
+        <w:pStyle w:val="Compact"/>
+      </w:pPr>
+      <w:r>
+        <w:t xml:space="preserve">All three passed. Only minor notes were found, listed in</w:t>
+      </w:r>
+      <w:r>
+        <w:t xml:space="preserve"> </w:t>
+      </w:r>
+      <w:r>
+        <w:rPr>
+          <w:rStyle w:val="VerbatimChar"/>
+        </w:rPr>
+        <w:t xml:space="preserve">checks/graph_methods_reports.md</w:t>
+      </w:r>
+      <w:r>
+        <w:t xml:space="preserve">.</w:t>
+      </w:r>
+    </w:p>
+    <w:p>
+      <w:pPr>
+        <w:numPr>
+          <w:ilvl w:val="0"/>
+          <w:numId w:val="1001"/>
+        </w:numPr>
+        <w:pStyle w:val="Compact"/>
+      </w:pPr>
+      <w:r>
+        <w:rPr>
+          <w:bCs/>
+          <w:b/>
+        </w:rPr>
+        <w:t xml:space="preserve">All methods re-run together</w:t>
+      </w:r>
+      <w:r>
+        <w:t xml:space="preserve"> </w:t>
+      </w:r>
+      <w:r>
+        <w:t xml:space="preserve">on the final files. The numbers matched the checkers’ numbers (</w:t>
+      </w:r>
+      <w:r>
+        <w:rPr>
+          <w:rStyle w:val="VerbatimChar"/>
+        </w:rPr>
+        <w:t xml:space="preserve">results_graph_methods.txt</w:t>
+      </w:r>
+      <w:r>
+        <w:t xml:space="preserve">).</w:t>
+      </w:r>
+    </w:p>
+    <w:p>
+      <w:pPr>
+        <w:numPr>
+          <w:ilvl w:val="0"/>
+          <w:numId w:val="1001"/>
+        </w:numPr>
+        <w:pStyle w:val="Compact"/>
+      </w:pPr>
+      <w:r>
+        <w:rPr>
+          <w:bCs/>
+          <w:b/>
+        </w:rPr>
+        <w:t xml:space="preserve">Next (running now):</w:t>
+      </w:r>
+      <w:r>
+        <w:t xml:space="preserve"> </w:t>
+      </w:r>
+      <w:r>
+        <w:t xml:space="preserve">the</w:t>
+      </w:r>
+      <w:r>
+        <w:t xml:space="preserve"> </w:t>
+      </w:r>
+      <w:r>
+        <w:t xml:space="preserve">“</w:t>
+      </w:r>
+      <w:r>
+        <w:t xml:space="preserve">greenhouse</w:t>
+      </w:r>
+      <w:r>
+        <w:t xml:space="preserve">”</w:t>
+      </w:r>
+      <w:r>
+        <w:t xml:space="preserve"> </w:t>
+      </w:r>
+      <w:r>
+        <w:t xml:space="preserve">test. It measures whether shared understanding (a model trained on the Bible) lets a much smaller seed regrow text exactly. It also measures whether the owner’s shifting word makes the model a better grower. This will be added here when it finishes.</w:t>
+      </w:r>
+    </w:p>
+    <w:bookmarkEnd w:id="22"/>
+    <w:bookmarkStart w:id="23" w:name="technical-details"/>
+    <w:p>
+      <w:pPr>
+        <w:pStyle w:val="Heading2"/>
+      </w:pPr>
+      <w:r>
+        <w:t xml:space="preserve">Technical details</w:t>
+      </w:r>
+    </w:p>
+    <w:p>
+      <w:pPr>
+        <w:numPr>
+          <w:ilvl w:val="0"/>
+          <w:numId w:val="1004"/>
+        </w:numPr>
+        <w:pStyle w:val="Compact"/>
+      </w:pPr>
+      <w:r>
+        <w:rPr>
+          <w:bCs/>
+          <w:b/>
+        </w:rPr>
+        <w:t xml:space="preserve">The four methods.</w:t>
+      </w:r>
+      <w:r>
+        <w:t xml:space="preserve"> </w:t>
+      </w:r>
+      <w:r>
+        <w:t xml:space="preserve">Each one is a file in</w:t>
+      </w:r>
+      <w:r>
+        <w:t xml:space="preserve"> </w:t>
+      </w:r>
+      <w:r>
+        <w:rPr>
+          <w:rStyle w:val="VerbatimChar"/>
+        </w:rPr>
+        <w:t xml:space="preserve">methods/</w:t>
+      </w:r>
+      <w:r>
+        <w:t xml:space="preserve"> </w:t>
+      </w:r>
+      <w:r>
+        <w:t xml:space="preserve">with two functions:</w:t>
+      </w:r>
+      <w:r>
+        <w:t xml:space="preserve"> </w:t>
+      </w:r>
+      <w:r>
+        <w:rPr>
+          <w:rStyle w:val="VerbatimChar"/>
+        </w:rPr>
+        <w:t xml:space="preserve">plant(data) -&gt; seed</w:t>
+      </w:r>
+      <w:r>
+        <w:t xml:space="preserve"> </w:t>
+      </w:r>
+      <w:r>
+        <w:t xml:space="preserve">and</w:t>
+      </w:r>
+      <w:r>
+        <w:t xml:space="preserve"> </w:t>
+      </w:r>
+      <w:r>
+        <w:rPr>
+          <w:rStyle w:val="VerbatimChar"/>
+        </w:rPr>
+        <w:t xml:space="preserve">grow(seed) -&gt; data</w:t>
+      </w:r>
+      <w:r>
+        <w:t xml:space="preserve">.</w:t>
+      </w:r>
+    </w:p>
+    <w:p>
+      <w:pPr>
+        <w:numPr>
+          <w:ilvl w:val="0"/>
+          <w:numId w:val="1004"/>
+        </w:numPr>
+        <w:pStyle w:val="Compact"/>
+      </w:pPr>
+      <w:r>
+        <w:rPr>
+          <w:bCs/>
+          <w:b/>
+        </w:rPr>
+        <w:t xml:space="preserve">Separate grower.</w:t>
+      </w:r>
+      <w:r>
+        <w:t xml:space="preserve"> </w:t>
+      </w:r>
+      <w:r>
+        <w:t xml:space="preserve">Each seed is grown by a separate</w:t>
+      </w:r>
+      <w:r>
+        <w:t xml:space="preserve"> </w:t>
+      </w:r>
+      <w:r>
+        <w:rPr>
+          <w:rStyle w:val="VerbatimChar"/>
+        </w:rPr>
+        <w:t xml:space="preserve">python -I</w:t>
+      </w:r>
+      <w:r>
+        <w:t xml:space="preserve"> </w:t>
+      </w:r>
+      <w:r>
+        <w:t xml:space="preserve">process, started in an empty temporary folder holding only</w:t>
+      </w:r>
+      <w:r>
+        <w:t xml:space="preserve"> </w:t>
+      </w:r>
+      <w:r>
+        <w:rPr>
+          <w:rStyle w:val="VerbatimChar"/>
+        </w:rPr>
+        <w:t xml:space="preserve">seed.bin</w:t>
+      </w:r>
+      <w:r>
+        <w:t xml:space="preserve">.</w:t>
+      </w:r>
+    </w:p>
+    <w:p>
+      <w:pPr>
+        <w:numPr>
+          <w:ilvl w:val="0"/>
+          <w:numId w:val="1004"/>
+        </w:numPr>
+        <w:pStyle w:val="Compact"/>
+      </w:pPr>
+      <w:r>
+        <w:rPr>
+          <w:bCs/>
+          <w:b/>
+        </w:rPr>
+        <w:t xml:space="preserve">Exactness check.</w:t>
+      </w:r>
+      <w:r>
+        <w:t xml:space="preserve"> </w:t>
+      </w:r>
+      <w:r>
+        <w:t xml:space="preserve">The regrown bytes are compared with the original by SHA-256 fingerprint.</w:t>
+      </w:r>
+    </w:p>
+    <w:p>
+      <w:pPr>
+        <w:numPr>
+          <w:ilvl w:val="0"/>
+          <w:numId w:val="1004"/>
+        </w:numPr>
+        <w:pStyle w:val="Compact"/>
+      </w:pPr>
+      <w:r>
+        <w:rPr>
+          <w:bCs/>
+          <w:b/>
+        </w:rPr>
+        <w:t xml:space="preserve">What counts as seed size.</w:t>
+      </w:r>
+      <w:r>
+        <w:t xml:space="preserve"> </w:t>
+      </w:r>
+      <w:r>
+        <w:t xml:space="preserve">Every byte the grower needs (lengths, flags, settings) is inside the seed. The grow instructions (the test script plus the method file) are counted once and are the same for every file.</w:t>
+      </w:r>
+    </w:p>
+    <w:p>
+      <w:pPr>
+        <w:numPr>
+          <w:ilvl w:val="0"/>
+          <w:numId w:val="1004"/>
+        </w:numPr>
+        <w:pStyle w:val="Compact"/>
+      </w:pPr>
+      <w:r>
+        <w:rPr>
+          <w:bCs/>
+          <w:b/>
+        </w:rPr>
+        <w:t xml:space="preserve">No hidden tools.</w:t>
+      </w:r>
+      <w:r>
+        <w:t xml:space="preserve"> </w:t>
+      </w:r>
+      <w:r>
+        <w:t xml:space="preserve">The graph methods use no zip or other compressor, only adding, subtracting, multiplying and remainders.</w:t>
+      </w:r>
+    </w:p>
+    <w:bookmarkEnd w:id="23"/>
+    <w:bookmarkStart w:id="24" w:name="how-to-run-it-yourself"/>
+    <w:p>
+      <w:pPr>
+        <w:pStyle w:val="Heading2"/>
+      </w:pPr>
+      <w:r>
+        <w:t xml:space="preserve">How to run it yourself</w:t>
+      </w:r>
+    </w:p>
+    <w:p>
+      <w:pPr>
+        <w:numPr>
+          <w:ilvl w:val="0"/>
+          <w:numId w:val="1005"/>
+        </w:numPr>
+        <w:pStyle w:val="Compact"/>
+      </w:pPr>
+      <w:r>
+        <w:t xml:space="preserve">Run</w:t>
+      </w:r>
+      <w:r>
+        <w:t xml:space="preserve"> </w:t>
+      </w:r>
+      <w:r>
+        <w:rPr>
+          <w:rStyle w:val="VerbatimChar"/>
+        </w:rPr>
+        <w:t xml:space="preserve">python seed_test.py</w:t>
+      </w:r>
+      <w:r>
+        <w:t xml:space="preserve"> </w:t>
+      </w:r>
+      <w:r>
+        <w:t xml:space="preserve">to test every method on the built-in test files.</w:t>
+      </w:r>
+    </w:p>
+    <w:p>
+      <w:pPr>
+        <w:numPr>
+          <w:ilvl w:val="0"/>
+          <w:numId w:val="1005"/>
+        </w:numPr>
+        <w:pStyle w:val="Compact"/>
+      </w:pPr>
+      <w:r>
+        <w:t xml:space="preserve">Run</w:t>
+      </w:r>
+      <w:r>
+        <w:t xml:space="preserve"> </w:t>
+      </w:r>
+      <w:r>
+        <w:rPr>
+          <w:rStyle w:val="VerbatimChar"/>
+        </w:rPr>
+        <w:t xml:space="preserve">python seed_test.py --method graph_fit photo.jpg letter.txt</w:t>
+      </w:r>
+      <w:r>
+        <w:t xml:space="preserve"> </w:t>
+      </w:r>
+      <w:r>
+        <w:t xml:space="preserve">to test one method on your own files.</w:t>
+      </w:r>
+    </w:p>
+    <w:p>
+      <w:pPr>
+        <w:numPr>
+          <w:ilvl w:val="0"/>
+          <w:numId w:val="1005"/>
+        </w:numPr>
+        <w:pStyle w:val="Compact"/>
+      </w:pPr>
+      <w:r>
+        <w:t xml:space="preserve">To try your own rules, copy any file in</w:t>
+      </w:r>
+      <w:r>
+        <w:t xml:space="preserve"> </w:t>
+      </w:r>
+      <w:r>
+        <w:rPr>
+          <w:rStyle w:val="VerbatimChar"/>
+        </w:rPr>
+        <w:t xml:space="preserve">methods/</w:t>
+      </w:r>
+      <w:r>
+        <w:t xml:space="preserve">, rename it, and change</w:t>
+      </w:r>
+      <w:r>
+        <w:t xml:space="preserve"> </w:t>
+      </w:r>
+      <w:r>
+        <w:rPr>
+          <w:rStyle w:val="VerbatimChar"/>
+        </w:rPr>
+        <w:t xml:space="preserve">plant()</w:t>
+      </w:r>
+      <w:r>
+        <w:t xml:space="preserve"> </w:t>
+      </w:r>
+      <w:r>
+        <w:t xml:space="preserve">and</w:t>
+      </w:r>
+      <w:r>
+        <w:t xml:space="preserve"> </w:t>
+      </w:r>
+      <w:r>
+        <w:rPr>
+          <w:rStyle w:val="VerbatimChar"/>
+        </w:rPr>
+        <w:t xml:space="preserve">grow()</w:t>
+      </w:r>
+      <w:r>
+        <w:t xml:space="preserve">.</w:t>
+      </w:r>
+    </w:p>
+    <w:bookmarkEnd w:id="24"/>
+    <w:bookmarkStart w:id="25" w:name="every-file-in-this-folder"/>
+    <w:p>
+      <w:pPr>
+        <w:pStyle w:val="Heading2"/>
+      </w:pPr>
+      <w:r>
+        <w:t xml:space="preserve">Every file in this folder</w:t>
+      </w:r>
+    </w:p>
+    <w:tbl>
+      <w:tblPr>
+        <w:tblStyle w:val="Table"/>
+        <w:tblW w:type="pct" w:w="5000"/>
+        <w:tblLook w:firstRow="1" w:lastRow="0" w:firstColumn="0" w:lastColumn="0" w:noHBand="0" w:noVBand="0" w:val="0020"/>
+        <w:jc w:val="start"/>
+      </w:tblPr>
+      <w:tblGrid>
+        <w:gridCol w:w="2640"/>
+        <w:gridCol w:w="2640"/>
+        <w:gridCol w:w="2640"/>
+      </w:tblGrid>
+      <w:tr>
+        <w:trPr>
+          <w:tblHeader w:val="true"/>
+        </w:trPr>
+        <w:tc>
+          <w:tcPr/>
+          <w:p>
+            <w:pPr>
+              <w:pStyle w:val="Compact"/>
+              <w:jc w:val="left"/>
+            </w:pPr>
+            <w:r>
+              <w:t xml:space="preserve">File (path inside this folder)</w:t>
             </w:r>
           </w:p>
         </w:tc>
@@ -284,6 +1305,95 @@
             </w:pPr>
             <w:r>
               <w:t xml:space="preserve">What it is</w:t>
+            </w:r>
+          </w:p>
+        </w:tc>
+        <w:tc>
+          <w:tcPr/>
+          <w:p>
+            <w:pPr>
+              <w:pStyle w:val="Compact"/>
+              <w:jc w:val="left"/>
+            </w:pPr>
+            <w:r>
+              <w:t xml:space="preserve">Where the original lives</w:t>
+            </w:r>
+          </w:p>
+        </w:tc>
+      </w:tr>
+      <w:tr>
+        <w:tc>
+          <w:tcPr/>
+          <w:p>
+            <w:pPr>
+              <w:pStyle w:val="Compact"/>
+              <w:jc w:val="left"/>
+            </w:pPr>
+            <w:r>
+              <w:rPr>
+                <w:rStyle w:val="VerbatimChar"/>
+              </w:rPr>
+              <w:t xml:space="preserve">00_START_HERE_Seed_Test.docx</w:t>
+            </w:r>
+            <w:r>
+              <w:t xml:space="preserve"> </w:t>
+            </w:r>
+            <w:r>
+              <w:t xml:space="preserve">/</w:t>
+            </w:r>
+            <w:r>
+              <w:t xml:space="preserve"> </w:t>
+            </w:r>
+            <w:r>
+              <w:rPr>
+                <w:rStyle w:val="VerbatimChar"/>
+              </w:rPr>
+              <w:t xml:space="preserve">.md</w:t>
+            </w:r>
+          </w:p>
+        </w:tc>
+        <w:tc>
+          <w:tcPr/>
+          <w:p>
+            <w:pPr>
+              <w:pStyle w:val="Compact"/>
+              <w:jc w:val="left"/>
+            </w:pPr>
+            <w:r>
+              <w:t xml:space="preserve">This guide (Word file, plus a text copy)</w:t>
+            </w:r>
+          </w:p>
+        </w:tc>
+        <w:tc>
+          <w:tcPr/>
+          <w:p>
+            <w:pPr>
+              <w:pStyle w:val="Compact"/>
+              <w:jc w:val="left"/>
+            </w:pPr>
+            <w:r>
+              <w:t xml:space="preserve">branch</w:t>
+            </w:r>
+            <w:r>
+              <w:t xml:space="preserve"> </w:t>
+            </w:r>
+            <w:r>
+              <w:rPr>
+                <w:rStyle w:val="VerbatimChar"/>
+              </w:rPr>
+              <w:t xml:space="preserve">ccr-1be0d913-1tlzao</w:t>
+            </w:r>
+            <w:r>
+              <w:t xml:space="preserve">,</w:t>
+            </w:r>
+            <w:r>
+              <w:t xml:space="preserve"> </w:t>
+            </w:r>
+            <w:r>
+              <w:rPr>
+                <w:rStyle w:val="VerbatimChar"/>
+              </w:rPr>
+              <w:t xml:space="preserve">SEED_TEST_2026-10-20/</w:t>
             </w:r>
           </w:p>
         </w:tc>
@@ -312,7 +1422,384 @@
               <w:jc w:val="left"/>
             </w:pPr>
             <w:r>
-              <w:t xml:space="preserve">The test. Until your rules are added, it uses ordinary zip compression as an example</w:t>
+              <w:t xml:space="preserve">The fair test. Runs every method, grows in a separate process, checks exactness</w:t>
+            </w:r>
+          </w:p>
+        </w:tc>
+        <w:tc>
+          <w:tcPr/>
+          <w:p>
+            <w:pPr>
+              <w:pStyle w:val="Compact"/>
+              <w:jc w:val="left"/>
+            </w:pPr>
+            <w:r>
+              <w:t xml:space="preserve">same branch and folder</w:t>
+            </w:r>
+          </w:p>
+        </w:tc>
+      </w:tr>
+      <w:tr>
+        <w:tc>
+          <w:tcPr/>
+          <w:p>
+            <w:pPr>
+              <w:pStyle w:val="Compact"/>
+              <w:jc w:val="left"/>
+            </w:pPr>
+            <w:r>
+              <w:rPr>
+                <w:rStyle w:val="VerbatimChar"/>
+              </w:rPr>
+              <w:t xml:space="preserve">methods/graph_fit.py</w:t>
+            </w:r>
+          </w:p>
+        </w:tc>
+        <w:tc>
+          <w:tcPr/>
+          <w:p>
+            <w:pPr>
+              <w:pStyle w:val="Compact"/>
+              <w:jc w:val="left"/>
+            </w:pPr>
+            <w:r>
+              <w:t xml:space="preserve">Graph method,</w:t>
+            </w:r>
+            <w:r>
+              <w:t xml:space="preserve"> </w:t>
+            </w:r>
+            <w:r>
+              <w:t xml:space="preserve">“</w:t>
+            </w:r>
+            <w:r>
+              <w:t xml:space="preserve">fit the shape</w:t>
+            </w:r>
+            <w:r>
+              <w:t xml:space="preserve">”</w:t>
+            </w:r>
+          </w:p>
+        </w:tc>
+        <w:tc>
+          <w:tcPr/>
+          <w:p>
+            <w:pPr>
+              <w:pStyle w:val="Compact"/>
+              <w:jc w:val="left"/>
+            </w:pPr>
+            <w:r>
+              <w:t xml:space="preserve">same branch,</w:t>
+            </w:r>
+            <w:r>
+              <w:t xml:space="preserve"> </w:t>
+            </w:r>
+            <w:r>
+              <w:rPr>
+                <w:rStyle w:val="VerbatimChar"/>
+              </w:rPr>
+              <w:t xml:space="preserve">SEED_TEST_2026-10-20/methods/</w:t>
+            </w:r>
+          </w:p>
+        </w:tc>
+      </w:tr>
+      <w:tr>
+        <w:tc>
+          <w:tcPr/>
+          <w:p>
+            <w:pPr>
+              <w:pStyle w:val="Compact"/>
+              <w:jc w:val="left"/>
+            </w:pPr>
+            <w:r>
+              <w:rPr>
+                <w:rStyle w:val="VerbatimChar"/>
+              </w:rPr>
+              <w:t xml:space="preserve">methods/graph_backwards.py</w:t>
+            </w:r>
+          </w:p>
+        </w:tc>
+        <w:tc>
+          <w:tcPr/>
+          <w:p>
+            <w:pPr>
+              <w:pStyle w:val="Compact"/>
+              <w:jc w:val="left"/>
+            </w:pPr>
+            <w:r>
+              <w:t xml:space="preserve">Graph method,</w:t>
+            </w:r>
+            <w:r>
+              <w:t xml:space="preserve"> </w:t>
+            </w:r>
+            <w:r>
+              <w:t xml:space="preserve">“</w:t>
+            </w:r>
+            <w:r>
+              <w:t xml:space="preserve">work backwards</w:t>
+            </w:r>
+            <w:r>
+              <w:t xml:space="preserve">”</w:t>
+            </w:r>
+          </w:p>
+        </w:tc>
+        <w:tc>
+          <w:tcPr/>
+          <w:p>
+            <w:pPr>
+              <w:pStyle w:val="Compact"/>
+              <w:jc w:val="left"/>
+            </w:pPr>
+            <w:r>
+              <w:t xml:space="preserve">same</w:t>
+            </w:r>
+          </w:p>
+        </w:tc>
+      </w:tr>
+      <w:tr>
+        <w:tc>
+          <w:tcPr/>
+          <w:p>
+            <w:pPr>
+              <w:pStyle w:val="Compact"/>
+              <w:jc w:val="left"/>
+            </w:pPr>
+            <w:r>
+              <w:rPr>
+                <w:rStyle w:val="VerbatimChar"/>
+              </w:rPr>
+              <w:t xml:space="preserve">methods/graph_locate.py</w:t>
+            </w:r>
+          </w:p>
+        </w:tc>
+        <w:tc>
+          <w:tcPr/>
+          <w:p>
+            <w:pPr>
+              <w:pStyle w:val="Compact"/>
+              <w:jc w:val="left"/>
+            </w:pPr>
+            <w:r>
+              <w:t xml:space="preserve">Graph method,</w:t>
+            </w:r>
+            <w:r>
+              <w:t xml:space="preserve"> </w:t>
+            </w:r>
+            <w:r>
+              <w:t xml:space="preserve">“</w:t>
+            </w:r>
+            <w:r>
+              <w:t xml:space="preserve">find it on a fixed page</w:t>
+            </w:r>
+            <w:r>
+              <w:t xml:space="preserve">”</w:t>
+            </w:r>
+          </w:p>
+        </w:tc>
+        <w:tc>
+          <w:tcPr/>
+          <w:p>
+            <w:pPr>
+              <w:pStyle w:val="Compact"/>
+              <w:jc w:val="left"/>
+            </w:pPr>
+            <w:r>
+              <w:t xml:space="preserve">same</w:t>
+            </w:r>
+          </w:p>
+        </w:tc>
+      </w:tr>
+      <w:tr>
+        <w:tc>
+          <w:tcPr/>
+          <w:p>
+            <w:pPr>
+              <w:pStyle w:val="Compact"/>
+              <w:jc w:val="left"/>
+            </w:pPr>
+            <w:r>
+              <w:rPr>
+                <w:rStyle w:val="VerbatimChar"/>
+              </w:rPr>
+              <w:t xml:space="preserve">results_graph_methods.txt</w:t>
+            </w:r>
+          </w:p>
+        </w:tc>
+        <w:tc>
+          <w:tcPr/>
+          <w:p>
+            <w:pPr>
+              <w:pStyle w:val="Compact"/>
+              <w:jc w:val="left"/>
+            </w:pPr>
+            <w:r>
+              <w:t xml:space="preserve">Output of the full run of all four methods</w:t>
+            </w:r>
+          </w:p>
+        </w:tc>
+        <w:tc>
+          <w:tcPr/>
+          <w:p>
+            <w:pPr>
+              <w:pStyle w:val="Compact"/>
+              <w:jc w:val="left"/>
+            </w:pPr>
+            <w:r>
+              <w:t xml:space="preserve">same folder</w:t>
+            </w:r>
+          </w:p>
+        </w:tc>
+      </w:tr>
+      <w:tr>
+        <w:tc>
+          <w:tcPr/>
+          <w:p>
+            <w:pPr>
+              <w:pStyle w:val="Compact"/>
+              <w:jc w:val="left"/>
+            </w:pPr>
+            <w:r>
+              <w:rPr>
+                <w:rStyle w:val="VerbatimChar"/>
+              </w:rPr>
+              <w:t xml:space="preserve">checks/graph_methods_reports.md</w:t>
+            </w:r>
+          </w:p>
+        </w:tc>
+        <w:tc>
+          <w:tcPr/>
+          <w:p>
+            <w:pPr>
+              <w:pStyle w:val="Compact"/>
+              <w:jc w:val="left"/>
+            </w:pPr>
+            <w:r>
+              <w:t xml:space="preserve">Full builder reports and independent checker reports for each method</w:t>
+            </w:r>
+          </w:p>
+        </w:tc>
+        <w:tc>
+          <w:tcPr/>
+          <w:p>
+            <w:pPr>
+              <w:pStyle w:val="Compact"/>
+              <w:jc w:val="left"/>
+            </w:pPr>
+            <w:r>
+              <w:t xml:space="preserve">same branch,</w:t>
+            </w:r>
+            <w:r>
+              <w:t xml:space="preserve"> </w:t>
+            </w:r>
+            <w:r>
+              <w:rPr>
+                <w:rStyle w:val="VerbatimChar"/>
+              </w:rPr>
+              <w:t xml:space="preserve">SEED_TEST_2026-10-20/checks/</w:t>
+            </w:r>
+          </w:p>
+        </w:tc>
+      </w:tr>
+      <w:tr>
+        <w:tc>
+          <w:tcPr/>
+          <w:p>
+            <w:pPr>
+              <w:pStyle w:val="Compact"/>
+              <w:jc w:val="left"/>
+            </w:pPr>
+            <w:r>
+              <w:rPr>
+                <w:rStyle w:val="VerbatimChar"/>
+              </w:rPr>
+              <w:t xml:space="preserve">test_inputs/kjv_first_100k.txt</w:t>
+            </w:r>
+          </w:p>
+        </w:tc>
+        <w:tc>
+          <w:tcPr/>
+          <w:p>
+            <w:pPr>
+              <w:pStyle w:val="Compact"/>
+              <w:jc w:val="left"/>
+            </w:pPr>
+            <w:r>
+              <w:t xml:space="preserve">First 100,000 bytes of the King James Bible (public domain), used as a text test</w:t>
+            </w:r>
+          </w:p>
+        </w:tc>
+        <w:tc>
+          <w:tcPr/>
+          <w:p>
+            <w:pPr>
+              <w:pStyle w:val="Compact"/>
+              <w:jc w:val="left"/>
+            </w:pPr>
+            <w:r>
+              <w:t xml:space="preserve">made from</w:t>
+            </w:r>
+            <w:r>
+              <w:t xml:space="preserve"> </w:t>
+            </w:r>
+            <w:r>
+              <w:rPr>
+                <w:rStyle w:val="VerbatimChar"/>
+              </w:rPr>
+              <w:t xml:space="preserve">experiments/data/KJV.txt</w:t>
+            </w:r>
+            <w:r>
+              <w:t xml:space="preserve"> </w:t>
+            </w:r>
+            <w:r>
+              <w:t xml:space="preserve">(not in git)</w:t>
+            </w:r>
+          </w:p>
+        </w:tc>
+      </w:tr>
+      <w:tr>
+        <w:tc>
+          <w:tcPr/>
+          <w:p>
+            <w:pPr>
+              <w:pStyle w:val="Compact"/>
+              <w:jc w:val="left"/>
+            </w:pPr>
+            <w:r>
+              <w:rPr>
+                <w:rStyle w:val="VerbatimChar"/>
+              </w:rPr>
+              <w:t xml:space="preserve">test_inputs/sample_word_file.docx</w:t>
+            </w:r>
+          </w:p>
+        </w:tc>
+        <w:tc>
+          <w:tcPr/>
+          <w:p>
+            <w:pPr>
+              <w:pStyle w:val="Compact"/>
+              <w:jc w:val="left"/>
+            </w:pPr>
+            <w:r>
+              <w:t xml:space="preserve">An 11 KB Word file, used as a document test</w:t>
+            </w:r>
+          </w:p>
+        </w:tc>
+        <w:tc>
+          <w:tcPr/>
+          <w:p>
+            <w:pPr>
+              <w:pStyle w:val="Compact"/>
+              <w:jc w:val="left"/>
+            </w:pPr>
+            <w:r>
+              <w:t xml:space="preserve">copy of</w:t>
+            </w:r>
+            <w:r>
+              <w:t xml:space="preserve"> </w:t>
+            </w:r>
+            <w:r>
+              <w:rPr>
+                <w:rStyle w:val="VerbatimChar"/>
+              </w:rPr>
+              <w:t xml:space="preserve">TECHNICAL_REPORT_2026-10-20/00_START_HERE_Technical_Report.docx</w:t>
             </w:r>
           </w:p>
         </w:tc>
@@ -331,32 +1818,96 @@
               </w:rPr>
               <w:t xml:space="preserve">SEED_TEST_2026-10-20.zip</w:t>
             </w:r>
-          </w:p>
-        </w:tc>
-        <w:tc>
-          <w:tcPr/>
-          <w:p>
-            <w:pPr>
-              <w:pStyle w:val="Compact"/>
-              <w:jc w:val="left"/>
-            </w:pPr>
-            <w:r>
-              <w:t xml:space="preserve">This folder as a zip (next to the folder)</w:t>
+            <w:r>
+              <w:t xml:space="preserve"> </w:t>
+            </w:r>
+            <w:r>
+              <w:t xml:space="preserve">(next to the folder)</w:t>
+            </w:r>
+          </w:p>
+        </w:tc>
+        <w:tc>
+          <w:tcPr/>
+          <w:p>
+            <w:pPr>
+              <w:pStyle w:val="Compact"/>
+              <w:jc w:val="left"/>
+            </w:pPr>
+            <w:r>
+              <w:t xml:space="preserve">This whole folder as a plain zip</w:t>
+            </w:r>
+          </w:p>
+        </w:tc>
+        <w:tc>
+          <w:tcPr/>
+          <w:p>
+            <w:pPr>
+              <w:pStyle w:val="Compact"/>
+              <w:jc w:val="left"/>
+            </w:pPr>
+            <w:r>
+              <w:t xml:space="preserve">repository top level</w:t>
             </w:r>
           </w:p>
         </w:tc>
       </w:tr>
     </w:tbl>
-    <w:p>
-      <w:pPr>
-        <w:pStyle w:val="BodyText"/>
-      </w:pPr>
-      <w:r>
-        <w:t xml:space="preserve">The repository is public.</w:t>
-      </w:r>
-    </w:p>
-    <w:bookmarkEnd w:id="23"/>
-    <w:bookmarkEnd w:id="24"/>
+    <w:bookmarkEnd w:id="25"/>
+    <w:bookmarkStart w:id="26" w:name="things-outside-this-folders-control"/>
+    <w:p>
+      <w:pPr>
+        <w:pStyle w:val="Heading2"/>
+      </w:pPr>
+      <w:r>
+        <w:t xml:space="preserve">Things outside this folder’s control</w:t>
+      </w:r>
+    </w:p>
+    <w:p>
+      <w:pPr>
+        <w:numPr>
+          <w:ilvl w:val="0"/>
+          <w:numId w:val="1006"/>
+        </w:numPr>
+        <w:pStyle w:val="Compact"/>
+      </w:pPr>
+      <w:r>
+        <w:rPr>
+          <w:bCs/>
+          <w:b/>
+        </w:rPr>
+        <w:t xml:space="preserve">The repository is public</w:t>
+      </w:r>
+      <w:r>
+        <w:t xml:space="preserve"> </w:t>
+      </w:r>
+      <w:r>
+        <w:t xml:space="preserve">on GitHub (MIT license): anyone can read these files. Changing that is the owner’s decision, in GitHub settings.</w:t>
+      </w:r>
+    </w:p>
+    <w:p>
+      <w:pPr>
+        <w:numPr>
+          <w:ilvl w:val="0"/>
+          <w:numId w:val="1006"/>
+        </w:numPr>
+        <w:pStyle w:val="Compact"/>
+      </w:pPr>
+      <w:r>
+        <w:rPr>
+          <w:bCs/>
+          <w:b/>
+        </w:rPr>
+        <w:t xml:space="preserve">A cloud session can’t place files on your devices.</w:t>
+      </w:r>
+      <w:r>
+        <w:t xml:space="preserve"> </w:t>
+      </w:r>
+      <w:r>
+        <w:t xml:space="preserve">It cannot put files on your laptop or phone directly; the files are sent to you in the app to save.</w:t>
+      </w:r>
+    </w:p>
+    <w:bookmarkEnd w:id="26"/>
+    <w:bookmarkEnd w:id="27"/>
     <w:sectPr/>
   </w:body>
 </w:document>
@@ -658,6 +2209,45 @@
     </w:lvlOverride>
   </w:num>
   <w:num w:numId="1002">
+    <w:abstractNumId w:val="991"/>
+  </w:num>
+  <w:num w:numId="1003">
+    <w:abstractNumId w:val="991"/>
+  </w:num>
+  <w:num w:numId="1004">
+    <w:abstractNumId w:val="991"/>
+  </w:num>
+  <w:num w:numId="1005">
+    <w:abstractNumId w:val="99411"/>
+    <w:lvlOverride w:ilvl="0">
+      <w:startOverride w:val="1"/>
+    </w:lvlOverride>
+    <w:lvlOverride w:ilvl="1">
+      <w:startOverride w:val="1"/>
+    </w:lvlOverride>
+    <w:lvlOverride w:ilvl="2">
+      <w:startOverride w:val="1"/>
+    </w:lvlOverride>
+    <w:lvlOverride w:ilvl="3">
+      <w:startOverride w:val="1"/>
+    </w:lvlOverride>
+    <w:lvlOverride w:ilvl="4">
+      <w:startOverride w:val="1"/>
+    </w:lvlOverride>
+    <w:lvlOverride w:ilvl="5">
+      <w:startOverride w:val="1"/>
+    </w:lvlOverride>
+    <w:lvlOverride w:ilvl="6">
+      <w:startOverride w:val="1"/>
+    </w:lvlOverride>
+    <w:lvlOverride w:ilvl="7">
+      <w:startOverride w:val="1"/>
+    </w:lvlOverride>
+    <w:lvlOverride w:ilvl="8">
+      <w:startOverride w:val="1"/>
+    </w:lvlOverride>
+  </w:num>
+  <w:num w:numId="1006">
     <w:abstractNumId w:val="991"/>
   </w:num>
 </w:numbering>

</xml_diff>